<commit_message>
feat: mentions légales loyer précédent locataire et extinction de solidarité
Branche calculerLoyerPrecedentLocataire (packages/core, jusqu'ici jamais
appelée) dans BailDocumentDocxService : montant + date de versement du
dernier loyer du précédent locataire (art. 3, loi n° 89-462) si celui-ci
est parti moins de 18 mois avant la signature, avec repli montant seul si
aucun versement n'est retrouvé. Ajoute la clause d'extinction de
solidarité (art. 8-1, VI) en cas de colocation réelle (bail_locataires).
Formulations validées avec l'utilisateur contre le texte Légifrance avant
implémentation.

Versionne aussi tmp/Modèle bail.docx et tmp/Modèle état des lieux.docx
(jusqu'ici gitignored, sans aucun autre mécanisme de sauvegarde —
pnpm backup:local ne couvre que Postgres) : ce sont les sources de vérité
du contenu légal généré, pas des artefacts jetables comme le reste de
tmp/, qui reste ignoré.

Co-Authored-By: Claude Sonnet 5 <noreply@anthropic.com>
</commit_message>
<xml_diff>
--- a/apps/backend/src/bail-document-docx/__fixtures__/modele-bail-test.docx
+++ b/apps/backend/src/bail-document-docx/__fixtures__/modele-bail-test.docx
@@ -2490,6 +2490,38 @@
           <w:szCs w:val="18"/>
         </w:rPr>
         <w:t>En cas d’occupation des lieux après la cessation du bail, l’indemnité d’occupation due à ce titre sera égale au double du loyer sans préjudice du paiement des charges contractuelles.</w:t>
+      </w:r>
+    </w:p>
+    <w:p>
+      <w:pPr>
+        <w:jc w:val="both"/>
+        <w:rPr>
+          <w:sz w:val="18"/>
+          <w:szCs w:val="18"/>
+        </w:rPr>
+      </w:pPr>
+      <w:r>
+        <w:rPr>
+          <w:sz w:val="18"/>
+          <w:szCs w:val="18"/>
+        </w:rPr>
+        <w:t>{#mentionLoyerPrecedentComplete}Conformément à l'article 3 de la loi n° 89-462 du 6 juillet 1989, le précédent locataire ayant quitté le logement moins de dix-huit mois avant la signature du présent bail, il est précisé que le montant du dernier loyer qui lui a été appliqué s'élevait à {montant loyer précédent locataire} € et que ce loyer a été versé le {date de versement loyer précédent locataire}.{/mentionLoyerPrecedentComplete}</w:t>
+      </w:r>
+    </w:p>
+    <w:p>
+      <w:pPr>
+        <w:jc w:val="both"/>
+        <w:rPr>
+          <w:sz w:val="18"/>
+          <w:szCs w:val="18"/>
+        </w:rPr>
+      </w:pPr>
+      <w:r>
+        <w:rPr>
+          <w:sz w:val="18"/>
+          <w:szCs w:val="18"/>
+        </w:rPr>
+        <w:t>{#mentionLoyerPrecedentMontantSeul}Conformément à l'article 3 de la loi n° 89-462 du 6 juillet 1989, le précédent locataire ayant quitté le logement moins de dix-huit mois avant la signature du présent bail, il est précisé que le montant du dernier loyer qui lui a été appliqué s'élevait à {montant loyer précédent locataire} €.{/mentionLoyerPrecedentMontantSeul}</w:t>
       </w:r>
     </w:p>
     <w:p>
@@ -4171,6 +4203,23 @@
           <w:szCs w:val="18"/>
         </w:rPr>
         <w:t>Il y aura solidarité et indivisibilité entre les parties désignées sous le nom de LOCATAIRE, et leurs ayants causes, pour le paiement de toutes les sommes dues en application du présent bail.</w:t>
+      </w:r>
+    </w:p>
+    <w:p>
+      <w:pPr>
+        <w:spacing w:before="120"/>
+        <w:jc w:val="both"/>
+        <w:rPr>
+          <w:sz w:val="18"/>
+          <w:szCs w:val="18"/>
+        </w:rPr>
+      </w:pPr>
+      <w:r>
+        <w:rPr>
+          <w:sz w:val="18"/>
+          <w:szCs w:val="18"/>
+        </w:rPr>
+        <w:t>{#colocation}Conformément à l'article 8-1, VI, alinéa 1er, de la loi n° 89-462 du 6 juillet 1989, la solidarité d'un des colocataires et celle de la personne qui s'est portée caution pour lui prennent fin à la date d'effet du congé régulièrement délivré et lorsqu'un nouveau colocataire figure au bail. A défaut, elles s'éteignent au plus tard à l'expiration d'un délai de six mois après la date d'effet du congé.{/colocation}</w:t>
       </w:r>
     </w:p>
     <w:tbl>

</xml_diff>

<commit_message>
feat(appartements): mentions de performance energetique dans le bail (decret 2015-587)
Classe DPE, dépenses énergétiques estimées (montant ou fourchette) et année
de référence des prix, saisies sur la fiche appartement (champs simples,
jamais via la table diagnostics, inutilisée). Insérées dans le modèle de
bail avec le texte exact des annexes 1/2 du décret n° 2015-587 (identique
vide/meublé, aucun bloc conditionnel) : niveau de performance, dépenses
énergétiques pour information, calendrier de décence énergétique.

Jamais bloquant pour la génération (décision Jimmy) : une marque "[À
COMPLÉTER : ...]" remplace chaque mention absente, jamais un blanc. Le
frontend affiche un avertissement listant les champs manquants (en-tête
X-Champs-Energie-Manquants) avant d'ouvrir le document généré.

Co-Authored-By: Claude Sonnet 5 <noreply@anthropic.com>
</commit_message>
<xml_diff>
--- a/apps/backend/src/bail-document-docx/__fixtures__/modele-bail-test.docx
+++ b/apps/backend/src/bail-document-docx/__fixtures__/modele-bail-test.docx
@@ -1630,6 +1630,54 @@
           <w:szCs w:val="16"/>
         </w:rPr>
         <w:fldChar w:fldCharType="end"/>
+      </w:r>
+    </w:p>
+    <w:p>
+      <w:pPr>
+        <w:spacing w:after="120"/>
+        <w:rPr>
+          <w:sz w:val="18"/>
+          <w:szCs w:val="18"/>
+        </w:rPr>
+      </w:pPr>
+      <w:r>
+        <w:rPr>
+          <w:sz w:val="18"/>
+          <w:szCs w:val="18"/>
+        </w:rPr>
+        <w:t xml:space="preserve">niveau de performance du logement : {classe DPE}.</w:t>
+      </w:r>
+    </w:p>
+    <w:p>
+      <w:pPr>
+        <w:spacing w:after="120"/>
+        <w:rPr>
+          <w:sz w:val="18"/>
+          <w:szCs w:val="18"/>
+        </w:rPr>
+      </w:pPr>
+      <w:r>
+        <w:rPr>
+          <w:sz w:val="18"/>
+          <w:szCs w:val="18"/>
+        </w:rPr>
+        <w:t xml:space="preserve">Dépenses énergétiques (pour information) : Montant estimé des dépenses annuelles d’énergie pour un usage standard de l’ensemble des usages énumérés dans le diagnostic de performance énergétique (chauffage, refroidissement, production d’eau chaude sanitaire, éclairage et auxiliaires de chauffage, de refroidissement, d’eau chaude sanitaire et de ventilation) mentionné à l’article L. 126-26 du code de la construction et de l’habitation : {dépenses énergétiques} € (estimation réalisée à partir des prix énergétiques de référence de l’année : {année de référence des prix énergétiques}).</w:t>
+      </w:r>
+    </w:p>
+    <w:p>
+      <w:pPr>
+        <w:spacing w:after="120"/>
+        <w:rPr>
+          <w:sz w:val="18"/>
+          <w:szCs w:val="18"/>
+        </w:rPr>
+      </w:pPr>
+      <w:r>
+        <w:rPr>
+          <w:sz w:val="18"/>
+          <w:szCs w:val="18"/>
+        </w:rPr>
+        <w:t xml:space="preserve">rappel : un logement décent doit respecter les critères minimaux de performance suivants : a) En France métropolitaine : i) A compter du 1er janvier 2025, le niveau de performance minimal du logement correspond à la classe F du DPE ; ii) A compter du 1er janvier 2028, le niveau de performance minimal du logement correspond à la classe E du DPE ; iii) A compter du 1er janvier 2034, le niveau de performance minimal du logement correspond à la classe D du DPE. b) En Guadeloupe, en Martinique, en Guyane, à La Réunion et à Mayotte : i) A compter du 1er janvier 2028, le niveau de performance minimal du logement correspond à la classe F du DPE ; ii) A compter du 1er janvier 2031, le niveau de performance minimal du logement correspond à la classe E du DPE. La consommation d’énergie finale et le niveau de performance du logement sont déterminés selon la méthode du diagnostic de performance énergétique mentionné à l’article L. 126-26 du code de la construction et de l’habitation.</w:t>
       </w:r>
     </w:p>
     <w:p>

</xml_diff>

<commit_message>
feat(bail-document-docx): clause de resiliation specifique au bail meuble (article 25-8)
Jusqu'ici le modele de bail n'imprimait que les clauses de resiliation
de l'article 15 (bail vide), meme pour un bail meuble. Ajoute un bloc
conditionnel {#meuble}/{^meuble} dans tmp/Modele bail.docx et la
fixture de test : preavis locataire 1 mois sans motif, preavis
bailleur 3 mois, motifs reprise/vente/motif legitime propres a
l'article 25-8 (sans mecanique d'offre de vente, absente de cet
article contrairement a l'article 15). Pas de sous-cas bail mobilite
ni etudiant (hors perimetre de baux.type_bail).

Co-Authored-By: Claude Sonnet 5 <noreply@anthropic.com>
</commit_message>
<xml_diff>
--- a/apps/backend/src/bail-document-docx/__fixtures__/modele-bail-test.docx
+++ b/apps/backend/src/bail-document-docx/__fixtures__/modele-bail-test.docx
@@ -3169,7 +3169,7 @@
           <w:sz w:val="18"/>
           <w:szCs w:val="18"/>
         </w:rPr>
-        <w:t xml:space="preserve">par le LOCATAIRE à tout moment, moyennant un délai de trois mois sans motif (partant de la date de réception de l’acte). </w:t>
+        <w:t xml:space="preserve">{^meuble}par le LOCATAIRE à tout moment, moyennant un délai de trois mois sans motif (partant de la date de réception de l’acte). </w:t>
       </w:r>
     </w:p>
     <w:p>
@@ -3290,7 +3290,128 @@
           <w:sz w:val="18"/>
           <w:szCs w:val="18"/>
         </w:rPr>
-        <w:t>sur un motif légitime et sérieux, notamment l’inexécution par le locataire de l’une des obligations lui incombant.</w:t>
+        <w:t>sur un motif légitime et sérieux, notamment l’inexécution par le locataire de l’une des obligations lui incombant.{/meuble}</w:t>
+      </w:r>
+    </w:p>
+    <w:p>
+      <w:pPr>
+        <w:pStyle w:val="Paragraphedeliste"/>
+        <w:numPr>
+          <w:ilvl w:val="0"/>
+          <w:numId w:val="1"/>
+        </w:numPr>
+        <w:jc w:val="both"/>
+        <w:rPr>
+          <w:sz w:val="18"/>
+          <w:szCs w:val="18"/>
+        </w:rPr>
+      </w:pPr>
+      <w:r>
+        <w:rPr>
+          <w:sz w:val="18"/>
+          <w:szCs w:val="18"/>
+        </w:rPr>
+        <w:t xml:space="preserve">{#meuble}par le LOCATAIRE à tout moment, avec préavis d'un mois (partant de la date de réception de l'acte), sans condition de motif, y compris lorsque la durée du bail est réduite à neuf mois.</w:t>
+      </w:r>
+    </w:p>
+    <w:p>
+      <w:pPr>
+        <w:pStyle w:val="Paragraphedeliste"/>
+        <w:numPr>
+          <w:ilvl w:val="0"/>
+          <w:numId w:val="1"/>
+        </w:numPr>
+        <w:jc w:val="both"/>
+        <w:rPr>
+          <w:sz w:val="18"/>
+          <w:szCs w:val="18"/>
+        </w:rPr>
+      </w:pPr>
+      <w:r>
+        <w:rPr>
+          <w:sz w:val="18"/>
+          <w:szCs w:val="18"/>
+        </w:rPr>
+        <w:t xml:space="preserve">par le BAILLEUR, à l'expiration du bail, moyennant un délai de préavis de trois mois (partant de la date de réception de l'acte).</w:t>
+      </w:r>
+    </w:p>
+    <w:p>
+      <w:pPr>
+        <w:jc w:val="both"/>
+        <w:rPr>
+          <w:sz w:val="18"/>
+          <w:szCs w:val="18"/>
+        </w:rPr>
+      </w:pPr>
+      <w:r>
+        <w:rPr>
+          <w:sz w:val="18"/>
+          <w:szCs w:val="18"/>
+        </w:rPr>
+        <w:t xml:space="preserve">Le motif du congé par le BAILLEUR doit être indiqué à peine de nullité. Ce motif doit être fondé :</w:t>
+      </w:r>
+    </w:p>
+    <w:p>
+      <w:pPr>
+        <w:pStyle w:val="Paragraphedeliste"/>
+        <w:numPr>
+          <w:ilvl w:val="0"/>
+          <w:numId w:val="2"/>
+        </w:numPr>
+        <w:jc w:val="both"/>
+        <w:rPr>
+          <w:sz w:val="18"/>
+          <w:szCs w:val="18"/>
+        </w:rPr>
+      </w:pPr>
+      <w:r>
+        <w:rPr>
+          <w:sz w:val="18"/>
+          <w:szCs w:val="18"/>
+        </w:rPr>
+        <w:t xml:space="preserve">sur la reprise du logement (nom et adresse du bénéficiaire de la reprise qui ne peut être que le BAILLEUR, son conjoint, le partenaire auquel il est lié par un pacte civil de solidarité enregistré à la date du congé, son concubin notoire depuis au moins un an à la date du congé, ses ascendants, ses descendants ou ceux de son conjoint, de son partenaire ou de son concubin notoire) ;</w:t>
+      </w:r>
+    </w:p>
+    <w:p>
+      <w:pPr>
+        <w:pStyle w:val="Paragraphedeliste"/>
+        <w:numPr>
+          <w:ilvl w:val="0"/>
+          <w:numId w:val="2"/>
+        </w:numPr>
+        <w:jc w:val="both"/>
+        <w:rPr>
+          <w:sz w:val="18"/>
+          <w:szCs w:val="18"/>
+        </w:rPr>
+      </w:pPr>
+      <w:r>
+        <w:rPr>
+          <w:sz w:val="18"/>
+          <w:szCs w:val="18"/>
+        </w:rPr>
+        <w:t xml:space="preserve">sur la vente du logement ;</w:t>
+      </w:r>
+    </w:p>
+    <w:p>
+      <w:pPr>
+        <w:pStyle w:val="Paragraphedeliste"/>
+        <w:numPr>
+          <w:ilvl w:val="0"/>
+          <w:numId w:val="2"/>
+        </w:numPr>
+        <w:jc w:val="both"/>
+        <w:rPr>
+          <w:sz w:val="18"/>
+          <w:szCs w:val="18"/>
+        </w:rPr>
+      </w:pPr>
+      <w:r>
+        <w:rPr>
+          <w:sz w:val="18"/>
+          <w:szCs w:val="18"/>
+        </w:rPr>
+        <w:t xml:space="preserve">sur un motif légitime et sérieux, notamment l'inexécution par le locataire de l'une des obligations lui incombant.{/meuble}</w:t>
       </w:r>
     </w:p>
     <w:p>

</xml_diff>

<commit_message>
feat(bail-document-docx): durees legales dynamiques pour les 5 regimes de bail (article 10, article 25-7)
Les deux phrases de la section III ("Duree de contrat" et "La presente
location est consentie...") etaient figees a 3 ans pour tous les
regimes, y compris meuble et meuble etudiant. calculerDureeBail
expose desormais reconductionTacite (false uniquement pour l'etudiant,
article 25-7 alinea 4) ; nouvelle fonction formaterDureeBail produit
le libelle chiffre ("3 ans", "1 an", "9 mois") depuis dureeMois, jamais
ecrit en dur. Le modele utilise les balises {duree bail} et un bloc
conditionnel {#reconductionTacite}/{^reconductionTacite} ; le regime
etudiant retire le segment de reconduction (absent legalement) plutot
que de l'afficher a tort.

Co-Authored-By: Claude Sonnet 5 <noreply@anthropic.com>
</commit_message>
<xml_diff>
--- a/apps/backend/src/bail-document-docx/__fixtures__/modele-bail-test.docx
+++ b/apps/backend/src/bail-document-docx/__fixtures__/modele-bail-test.docx
@@ -1766,7 +1766,7 @@
           <w:sz w:val="18"/>
           <w:szCs w:val="18"/>
         </w:rPr>
-        <w:t>Durée de contrat : 3 année reconductible par tacite reconduction par période de : 3 ans</w:t>
+        <w:t>Durée de contrat : {duree bail}{#reconductionTacite} reconductible par tacite reconduction par période de : {duree bail}{/reconductionTacite}{^reconductionTacite}, non reconductible par tacite reconduction{/reconductionTacite}</w:t>
       </w:r>
     </w:p>
     <w:p>
@@ -2299,7 +2299,7 @@
           <w:sz w:val="18"/>
           <w:szCs w:val="18"/>
         </w:rPr>
-        <w:t>La présente location est consentie et acceptée pour une durée de 3 ans renouvelable ensuite par tacite reconduction et par périodes de 3 ans (voir conditions particulières en page 2) faute de congé préalable.</w:t>
+        <w:t>La présente location est consentie et acceptée pour une durée de {duree bail} {#reconductionTacite}renouvelable ensuite par tacite reconduction et par périodes de {duree bail} (voir conditions particulières en page 2) faute de congé préalable.{/reconductionTacite}{^reconductionTacite}(voir conditions particulières en page 2). Conformément à l’article 25-7 de la loi du 6 juillet 1989, cette durée n’est pas renouvelable par tacite reconduction.{/reconductionTacite}</w:t>
       </w:r>
     </w:p>
     <w:tbl>

</xml_diff>

<commit_message>
fix(bail-document-docx): retirer la mention taxe d'habitation et corriger 3 coquilles du conge (commit A)
Retire la clause de presentation des quittances de taxe d'habitation
(article 1686 du C.G.I., obligation supprimee), et corrige 3 coquilles
typographiques dans le bloc de motifs de conge du bail vide : "handicape
;," -> "handicape ;", "concubin notoire). ;" -> "concubin notoire) ;",
"pendant deux premiers mois" -> "pendant les deux premiers mois".

Applique a l'identique aux deux modeles (assets/modele-bail.docx et
__fixtures__/modele-bail-test.docx), verifie zip-identique (16 entrees,
aucune piece perdue) avant commit.
</commit_message>
<xml_diff>
--- a/apps/backend/src/bail-document-docx/__fixtures__/modele-bail-test.docx
+++ b/apps/backend/src/bail-document-docx/__fixtures__/modele-bail-test.docx
@@ -3190,7 +3190,7 @@
           <w:sz w:val="18"/>
           <w:szCs w:val="18"/>
         </w:rPr>
-        <w:t>par le LOCATAIRE à tout moment, avec préavis d’un mois (partant de la date de réception de l’acte), à condition de justifier l’un des motifs suivants : en cas de mutation professionnelle, de perte d’emploi ou de nouvel emploi consécutif à une perte d’emploi ; si le logement est situé sur l’un des territoires mentionnés au premier alinéa du I de l’article 17 de la loi du 06/07/89 ; si le logement est situé dans l’une des zones tendues définies par le décret n° 2013-392 du 10 mai 2013; si son état de santé, constaté par un certificat médical, justifie un changement de domicile ; s’il est bénéficiaire du revenu de solidarité active ou de l’allocation adulte handicapé ;, s’il s’est vu attribuer un logement défini à l’article L. 351-2 du code de la construction et de l’habitation (logement social) ; s’il obtient son premier emploi au sens de l’art.223 de la loi de « modernisation sociale » du 17 janvier 2002.</w:t>
+        <w:t>par le LOCATAIRE à tout moment, avec préavis d’un mois (partant de la date de réception de l’acte), à condition de justifier l’un des motifs suivants : en cas de mutation professionnelle, de perte d’emploi ou de nouvel emploi consécutif à une perte d’emploi ; si le logement est situé sur l’un des territoires mentionnés au premier alinéa du I de l’article 17 de la loi du 06/07/89 ; si le logement est situé dans l’une des zones tendues définies par le décret n° 2013-392 du 10 mai 2013; si son état de santé, constaté par un certificat médical, justifie un changement de domicile ; s’il est bénéficiaire du revenu de solidarité active ou de l’allocation adulte handicapé ; s’il s’est vu attribuer un logement défini à l’article L. 351-2 du code de la construction et de l’habitation (logement social) ; s’il obtient son premier emploi au sens de l’art.223 de la loi de « modernisation sociale » du 17 janvier 2002.</w:t>
       </w:r>
     </w:p>
     <w:p>
@@ -3248,7 +3248,7 @@
           <w:sz w:val="18"/>
           <w:szCs w:val="18"/>
         </w:rPr>
-        <w:t>sur la reprise du logement (nom et adresse du bénéficiaire de la reprise qui ne peut être que le BAILLEUR, son conjoint, le partenaire auquel il est lié par un pacte civil de solidarité enregistré à la date du congé, son concubin notoire depuis au moins un an à la date du congé, ses ascendants, ses descendants ou ceux de son conjoint, de son partenaire ou de son concubin notoire). ;</w:t>
+        <w:t>sur la reprise du logement (nom et adresse du bénéficiaire de la reprise qui ne peut être que le BAILLEUR, son conjoint, le partenaire auquel il est lié par un pacte civil de solidarité enregistré à la date du congé, son concubin notoire depuis au moins un an à la date du congé, ses ascendants, ses descendants ou ceux de son conjoint, de son partenaire ou de son concubin notoire) ;</w:t>
       </w:r>
     </w:p>
     <w:p>
@@ -3269,7 +3269,7 @@
           <w:sz w:val="18"/>
           <w:szCs w:val="18"/>
         </w:rPr>
-        <w:t>en vue de la vente du logement (prix, conditions de la vente). Dans ce cas, le congé vaut offre de vente au locataire pendant deux premiers mois du délai de préavis ;</w:t>
+        <w:t>en vue de la vente du logement (prix, conditions de la vente). Dans ce cas, le congé vaut offre de vente au locataire pendant les deux premiers mois du délai de préavis ;</w:t>
       </w:r>
     </w:p>
     <w:p>
@@ -3811,7 +3811,7 @@
           <w:sz w:val="18"/>
           <w:szCs w:val="18"/>
         </w:rPr>
-        <w:t>Ne pas déménager sans s’être conformé à ses obligations (paiement des loyers, des charges et des contributions diverses lui incombant personnellement, relevé des différents compteurs, exécution des réparations locatives, etc…), ni sans avoir auparavant présenté au BAILLEUR les quittances justifiant du paiement de la taxe d’habitation (article 1686 du C.G.I.)</w:t>
+        <w:t>Ne pas déménager sans s’être conformé à ses obligations (paiement des loyers, des charges et des contributions diverses lui incombant personnellement, relevé des différents compteurs, exécution des réparations locatives, etc…).</w:t>
       </w:r>
     </w:p>
     <w:p>

</xml_diff>

<commit_message>
fix(bail-document-docx): reecrire propreté, indemnite d'occupation, frais et manquements, conge (commit B)
Remplace le forfait menage de 100 euros par une clause de proprete
proportionnee au defaut constate (B.1), remplace l'indemnite
d'occupation forfaitaire "au double du loyer" par une formulation
conforme au droit commun (B.2), fusionne les deux paragraphes "frais et
manquements" en un seul avec suppression reelle du second <w:p> et met
a jour le titre de section en consequence (B.3), et reecrit les deux
premieres phrases du conge en supprimant la phrase de clause penale
(B.4). B.5 (reconduction tacite) volontairement non touche.

Applique a l'identique aux deux modeles (assets/modele-bail.docx et
__fixtures__/modele-bail-test.docx), verifie zip-identique (16 entrees)
avant commit.
</commit_message>
<xml_diff>
--- a/apps/backend/src/bail-document-docx/__fixtures__/modele-bail-test.docx
+++ b/apps/backend/src/bail-document-docx/__fixtures__/modele-bail-test.docx
@@ -2537,7 +2537,7 @@
           <w:sz w:val="18"/>
           <w:szCs w:val="18"/>
         </w:rPr>
-        <w:t>En cas d’occupation des lieux après la cessation du bail, l’indemnité d’occupation due à ce titre sera égale au double du loyer sans préjudice du paiement des charges contractuelles.</w:t>
+        <w:t>À compter de la cessation effective du bail, si le locataire se maintient dans les lieux sans droit ni titre, il sera redevable d’une indemnité d’occupation jusqu’à la libération effective des lieux et la restitution des clés. Cette indemnité sera fixée conformément aux règles applicables, en tenant compte notamment du montant du loyer et des charges, sans préjudice du droit de chaque partie de solliciter en justice la fixation de son montant.</w:t>
       </w:r>
     </w:p>
     <w:p>
@@ -3428,7 +3428,7 @@
           <w:szCs w:val="18"/>
         </w:rPr>
         <w:lastRenderedPageBreak/>
-        <w:t>Le congé devra être signifié à l’autre partie par lettre recommandée avec accusé de réception ou par acte d’huissier. La notification de résiliation ou de fin de bail vaudra engagement formel de partir et renonciation à tout maintien dans les lieux, sans qu’il soit besoin de ne recourir à aucune formalité. Faute de libérer les lieux à la date convenue, la clause pénale incluse au présent contrat sera immédiatement applicable.</w:t>
+        <w:t>Le congé est délivré par la partie qui en prend l’initiative dans les formes, délais et conditions prévus par la loi applicable au présent contrat. Selon les dispositions légales applicables, la notification peut notamment être effectuée par lettre recommandée avec demande d’avis de réception, par acte de commissaire de justice ou par remise en main propre contre émargement ou récépissé signé, lorsque ce mode de notification est admis. La cessation du bail ne dispense aucune partie du respect des procédures légales applicables à la libération des lieux et, le cas échéant, à l’expulsion.</w:t>
       </w:r>
     </w:p>
     <w:tbl>
@@ -4107,7 +4107,7 @@
           <w:sz w:val="18"/>
           <w:szCs w:val="18"/>
         </w:rPr>
-        <w:t>Le BAILLEUR complète les états des lieux d’entrée et de sortie par les relevés des index pour chaque énergie, en présence d’une installation de chauffage ou d’eau chaude sanitaire individuelle, ou collective avec un comptage individuel. Le LOCATAIRE devra restituer l’appartement propre le jour de l’état des lieux de sortie, ou il sera retenu la somme de 100 euros pour frais de ménage sur le montant de la caution.</w:t>
+        <w:t>Le BAILLEUR complète les états des lieux d’entrée et de sortie par les relevés des index pour chaque énergie, en présence d’une installation de chauffage ou d’eau chaude sanitaire individuelle, ou collective avec un comptage individuel. Le locataire devra restituer le logement dans un état de propreté conforme à celui constaté lors de l’entrée dans les lieux, compte tenu de la vétusté et de l’usure normale. Si l’état des lieux de sortie fait apparaître un défaut de propreté imputable au locataire nécessitant une intervention de nettoyage, le bailleur pourra demander le remboursement du coût justifié de cette intervention, dans la mesure où celle-ci relève des obligations du locataire. Toute retenue sur le dépôt de garantie devra être justifiée conformément à l’article 22 de la loi n° 89-462 du 6 juillet 1989.</w:t>
       </w:r>
     </w:p>
     <w:tbl>
@@ -4141,7 +4141,7 @@
                 <w:sz w:val="18"/>
                 <w:szCs w:val="18"/>
               </w:rPr>
-              <w:t>CLAUSE RESOLUTOIRE ET CLAUSE PENALE</w:t>
+              <w:t>CLAUSE RESOLUTOIRE ET CONSEQUENCES DES MANQUEMENTS CONTRACTUELS</w:t>
             </w:r>
           </w:p>
         </w:tc>
@@ -4246,24 +4246,7 @@
           <w:sz w:val="18"/>
           <w:szCs w:val="18"/>
         </w:rPr>
-        <w:t>Le coût des commandements, sommations ou significations ci-dessus, y compris le droit proportionnel et les frais d’huissiers, d’avoués et d’avocats sera à la charge du locataire qui devra les rembourser dans les huit jours de la demande qui lui en sera faite.</w:t>
-      </w:r>
-    </w:p>
-    <w:p>
-      <w:pPr>
-        <w:spacing w:after="120"/>
-        <w:jc w:val="both"/>
-        <w:rPr>
-          <w:sz w:val="18"/>
-          <w:szCs w:val="18"/>
-        </w:rPr>
-      </w:pPr>
-      <w:r>
-        <w:rPr>
-          <w:sz w:val="18"/>
-          <w:szCs w:val="18"/>
-        </w:rPr>
-        <w:t>De plus, le BAILLEUR se réserve le droit de réclamer des dommages et intérêts supplémentaire s’il était contraint de saisir le tribunal pour faire valoir ses droits.</w:t>
+        <w:t>En cas de manquement du locataire à ses obligations, le bailleur pourra solliciter l’exécution des obligations concernées et, le cas échéant, la réparation du préjudice effectivement subi, dans les conditions prévues par les textes applicables. Les frais de procédure et les frais de recouvrement ne pourront être mis à la charge du locataire que dans les conditions prévues par la loi et, le cas échéant, par la décision de justice applicable.</w:t>
       </w:r>
     </w:p>
     <w:tbl>

</xml_diff>